<commit_message>
fix(OPS-01): each of the three decisions names its decider in the same form
Two of them read weakly. "That is the call" is passive about who made it, and
"That is product's call" attributes to a function rather than to the person
sitting in the meeting. Both now read "my call" in the decider's own turn,
which is what module 14 has to be able to cite, and what OPS-03B's two
agreeing topics have to agree with. The third already read that way.

No plant moves: the decision set is unchanged, the deciders are unchanged,
and the reasons are unchanged. Rebuilt the DOCX; validate still reports the
same four allowlisted features and the suite is green.

Co-Authored-By: Claude Fable 5 <noreply@anthropic.com>
Claude-Session: 401b4daa-602c-451d-b686-faf3902d546a
</commit_message>
<xml_diff>
--- a/artifacts/OPS-01/build/meeting-transcript-with-commitments.docx
+++ b/artifacts/OPS-01/build/meeting-transcript-with-commitments.docx
@@ -393,7 +393,7 @@
         <w:pStyle w:val="BodyText"/>
       </w:pPr>
       <w:r>
-        <w:t xml:space="preserve">[00:13:05] Oleander Underhill (VP, Operations): Then the sequence goes by region readiness, not by account size. That is the call, and the reason on the record is that readiness is the constraint and volume is not.</w:t>
+        <w:t xml:space="preserve">[00:13:05] Oleander Underhill (VP, Operations): Then the sequence goes by region readiness, not by account size. That is my call, and the reason on the record is that readiness is the constraint and volume is not.</w:t>
       </w:r>
     </w:p>
     <w:p>
@@ -641,7 +641,7 @@
         <w:pStyle w:val="BodyText"/>
       </w:pPr>
       <w:r>
-        <w:t xml:space="preserve">[00:29:43] Verity Blackwood (Senior Product Manager): It is exactly how. So the template stays in one shared place and teams link to it instead of copying it. That is product’s call, and the reason is that the copies drifted last time and support could not tell which version a customer had been shown.</w:t>
+        <w:t xml:space="preserve">[00:29:43] Verity Blackwood (Senior Product Manager): It is exactly how. So the template stays in one shared place and teams link to it instead of copying it. That one is my call, and the reason is that the copies drifted last time and support could not tell which version a customer had been shown.</w:t>
       </w:r>
     </w:p>
     <w:p>

</xml_diff>